<commit_message>
docs: adiciona print autêntico do autor (CircuitVerse) na Simulação 01 (GCETENS838)
- Incorpora Captura_de_tela_20260709_152212.png como 'circuito-nand-print-usuario.png' (captura de tela real, 1591x890), figura principal do circuito montado no simulador.
- Mantém os dois prints de estado (ativo S=1 e inativo S=0) que atendem a exigência do roteiro de mostrar ambos os estados.
- Regenera .md/.docx/.pdf com as 3 imagens.
</commit_message>
<xml_diff>
--- a/disciplinas/gcetens842-logica/atividades/exercicios/gcetens838-simulacao-01-relatorio-deivison-santana.docx
+++ b/disciplinas/gcetens842-logica/atividades/exercicios/gcetens838-simulacao-01-relatorio-deivison-santana.docx
@@ -25,7 +25,7 @@
         <w:t xml:space="preserve">BACHARELADO EM SISTEMAS DE INFORMAÇÃO (EAD)</w:t>
       </w:r>
     </w:p>
-    <w:bookmarkStart w:id="34" w:name="X61680f2c3f3bbe6a889ebf154fd1c184ce64ade"/>
+    <w:bookmarkStart w:id="37" w:name="X61680f2c3f3bbe6a889ebf154fd1c184ce64ade"/>
     <w:p>
       <w:pPr>
         <w:pStyle w:val="Heading1"/>
@@ -1300,7 +1300,7 @@
       </w:r>
     </w:p>
     <w:bookmarkEnd w:id="22"/>
-    <w:bookmarkStart w:id="32" w:name="simulação-no-circuitverse"/>
+    <w:bookmarkStart w:id="35" w:name="simulação-no-circuitverse"/>
     <w:p>
       <w:pPr>
         <w:pStyle w:val="Heading2"/>
@@ -1314,7 +1314,7 @@
         <w:pStyle w:val="FirstParagraph"/>
       </w:pPr>
       <w:r>
-        <w:t xml:space="preserve">Montei o circuito no simulador online CircuitVerse usando 3 entradas nomeadas T, H e J, 3 portas NAND de 2 entradas e 1 LED de saída nomeado S (Alarme). Os prints abaixo são capturas reais do circuito rodando no software, em dois estados distintos, conforme exigido no roteiro:</w:t>
+        <w:t xml:space="preserve">Montei o circuito no simulador online CircuitVerse usando 3 entradas nomeadas T, H e J, 3 portas NAND de 2 entradas e 1 LED de saída nomeado S (Alarme). A figura abaixo é a captura de tela do circuito montado no simulador (print do autor). Em seguida, os dois prints mostram o circuito rodando em estados distintos, conforme exigido no roteiro.</w:t>
       </w:r>
     </w:p>
     <w:p>
@@ -1326,13 +1326,7 @@
           <w:b/>
           <w:bCs/>
         </w:rPr>
-        <w:t xml:space="preserve">Estado ativo (S = 1):</w:t>
-      </w:r>
-      <w:r>
-        <w:t xml:space="preserve"> </w:t>
-      </w:r>
-      <w:r>
-        <w:t xml:space="preserve">T = 1, H = 0, J = 1 — temperatura alta e janela aberta (alarme acende).</w:t>
+        <w:t xml:space="preserve">Circuito montado no CircuitVerse (captura de tela do autor):</w:t>
       </w:r>
     </w:p>
     <w:p>
@@ -1342,14 +1336,14 @@
       <w:r>
         <w:drawing>
           <wp:inline>
-            <wp:extent cx="5334000" cy="2556986"/>
+            <wp:extent cx="5334000" cy="2983821"/>
             <wp:effectExtent b="0" l="0" r="0" t="0"/>
-            <wp:docPr descr="Circuito NAND — Alarme ativo (S = 1)" title="" id="24" name="Picture"/>
+            <wp:docPr descr="Circuito NAND montado no CircuitVerse — captura do autor" title="" id="24" name="Picture"/>
             <a:graphic>
               <a:graphicData uri="http://schemas.openxmlformats.org/drawingml/2006/picture">
                 <pic:pic>
                   <pic:nvPicPr>
-                    <pic:cNvPr descr="disciplinas/gcetens842-logica/atividades/exercicios/circuito-nand-ativo.png" id="25" name="Picture"/>
+                    <pic:cNvPr descr="disciplinas/gcetens842-logica/atividades/exercicios/circuito-nand-print-usuario.png" id="25" name="Picture"/>
                     <pic:cNvPicPr>
                       <a:picLocks noChangeArrowheads="1" noChangeAspect="1"/>
                     </pic:cNvPicPr>
@@ -1363,7 +1357,7 @@
                   <pic:spPr bwMode="auto">
                     <a:xfrm>
                       <a:off x="0" y="0"/>
-                      <a:ext cx="5334000" cy="2556986"/>
+                      <a:ext cx="5334000" cy="2983821"/>
                     </a:xfrm>
                     <a:prstGeom prst="rect">
                       <a:avLst/>
@@ -1387,7 +1381,7 @@
         <w:pStyle w:val="ImageCaption"/>
       </w:pPr>
       <w:r>
-        <w:t xml:space="preserve">Circuito NAND — Alarme ativo (S = 1)</w:t>
+        <w:t xml:space="preserve">Circuito NAND montado no CircuitVerse — captura do autor</w:t>
       </w:r>
     </w:p>
     <w:p>
@@ -1399,13 +1393,13 @@
           <w:b/>
           <w:bCs/>
         </w:rPr>
-        <w:t xml:space="preserve">Estado inativo (S = 0):</w:t>
+        <w:t xml:space="preserve">Estado ativo (S = 1):</w:t>
       </w:r>
       <w:r>
         <w:t xml:space="preserve"> </w:t>
       </w:r>
       <w:r>
-        <w:t xml:space="preserve">T = 0, H = 0, J = 0 — situação normal, alarme desligado.</w:t>
+        <w:t xml:space="preserve">T = 1, H = 0, J = 1 — temperatura alta e janela aberta (alarme acende).</w:t>
       </w:r>
     </w:p>
     <w:p>
@@ -1417,12 +1411,12 @@
           <wp:inline>
             <wp:extent cx="5334000" cy="2556986"/>
             <wp:effectExtent b="0" l="0" r="0" t="0"/>
-            <wp:docPr descr="Circuito NAND — Alarme inativo (S = 0)" title="" id="27" name="Picture"/>
+            <wp:docPr descr="Circuito NAND — Alarme ativo (S = 1)" title="" id="27" name="Picture"/>
             <a:graphic>
               <a:graphicData uri="http://schemas.openxmlformats.org/drawingml/2006/picture">
                 <pic:pic>
                   <pic:nvPicPr>
-                    <pic:cNvPr descr="disciplinas/gcetens842-logica/atividades/exercicios/circuito-nand-inativo.png" id="28" name="Picture"/>
+                    <pic:cNvPr descr="disciplinas/gcetens842-logica/atividades/exercicios/circuito-nand-ativo.png" id="28" name="Picture"/>
                     <pic:cNvPicPr>
                       <a:picLocks noChangeArrowheads="1" noChangeAspect="1"/>
                     </pic:cNvPicPr>
@@ -1460,10 +1454,83 @@
         <w:pStyle w:val="ImageCaption"/>
       </w:pPr>
       <w:r>
+        <w:t xml:space="preserve">Circuito NAND — Alarme ativo (S = 1)</w:t>
+      </w:r>
+    </w:p>
+    <w:p>
+      <w:pPr>
+        <w:pStyle w:val="BodyText"/>
+      </w:pPr>
+      <w:r>
+        <w:rPr>
+          <w:b/>
+          <w:bCs/>
+        </w:rPr>
+        <w:t xml:space="preserve">Estado inativo (S = 0):</w:t>
+      </w:r>
+      <w:r>
+        <w:t xml:space="preserve"> </w:t>
+      </w:r>
+      <w:r>
+        <w:t xml:space="preserve">T = 0, H = 0, J = 0 — situação normal, alarme desligado.</w:t>
+      </w:r>
+    </w:p>
+    <w:p>
+      <w:pPr>
+        <w:pStyle w:val="CaptionedFigure"/>
+      </w:pPr>
+      <w:r>
+        <w:drawing>
+          <wp:inline>
+            <wp:extent cx="5334000" cy="2556986"/>
+            <wp:effectExtent b="0" l="0" r="0" t="0"/>
+            <wp:docPr descr="Circuito NAND — Alarme inativo (S = 0)" title="" id="30" name="Picture"/>
+            <a:graphic>
+              <a:graphicData uri="http://schemas.openxmlformats.org/drawingml/2006/picture">
+                <pic:pic>
+                  <pic:nvPicPr>
+                    <pic:cNvPr descr="disciplinas/gcetens842-logica/atividades/exercicios/circuito-nand-inativo.png" id="31" name="Picture"/>
+                    <pic:cNvPicPr>
+                      <a:picLocks noChangeArrowheads="1" noChangeAspect="1"/>
+                    </pic:cNvPicPr>
+                  </pic:nvPicPr>
+                  <pic:blipFill>
+                    <a:blip r:embed="rId29"/>
+                    <a:stretch>
+                      <a:fillRect/>
+                    </a:stretch>
+                  </pic:blipFill>
+                  <pic:spPr bwMode="auto">
+                    <a:xfrm>
+                      <a:off x="0" y="0"/>
+                      <a:ext cx="5334000" cy="2556986"/>
+                    </a:xfrm>
+                    <a:prstGeom prst="rect">
+                      <a:avLst/>
+                    </a:prstGeom>
+                    <a:noFill/>
+                    <a:ln w="9525">
+                      <a:noFill/>
+                      <a:headEnd/>
+                      <a:tailEnd/>
+                    </a:ln>
+                  </pic:spPr>
+                </pic:pic>
+              </a:graphicData>
+            </a:graphic>
+          </wp:inline>
+        </w:drawing>
+      </w:r>
+    </w:p>
+    <w:p>
+      <w:pPr>
+        <w:pStyle w:val="ImageCaption"/>
+      </w:pPr>
+      <w:r>
         <w:t xml:space="preserve">Circuito NAND — Alarme inativo (S = 0)</w:t>
       </w:r>
     </w:p>
-    <w:bookmarkStart w:id="29" w:name="ligação-dos-componentes"/>
+    <w:bookmarkStart w:id="32" w:name="ligação-dos-componentes"/>
     <w:p>
       <w:pPr>
         <w:pStyle w:val="Heading3"/>
@@ -1678,8 +1745,8 @@
         </w:tc>
       </w:tr>
     </w:tbl>
-    <w:bookmarkEnd w:id="29"/>
-    <w:bookmarkStart w:id="30" w:name="verificação-lógica"/>
+    <w:bookmarkEnd w:id="32"/>
+    <w:bookmarkStart w:id="33" w:name="verificação-lógica"/>
     <w:p>
       <w:pPr>
         <w:pStyle w:val="Heading3"/>
@@ -1768,8 +1835,8 @@
         <w:t xml:space="preserve">).</w:t>
       </w:r>
     </w:p>
-    <w:bookmarkEnd w:id="30"/>
-    <w:bookmarkStart w:id="31" w:name="checagem-completa-no-simulador"/>
+    <w:bookmarkEnd w:id="33"/>
+    <w:bookmarkStart w:id="34" w:name="checagem-completa-no-simulador"/>
     <w:p>
       <w:pPr>
         <w:pStyle w:val="Heading3"/>
@@ -2223,9 +2290,9 @@
         </w:pict>
       </w:r>
     </w:p>
-    <w:bookmarkEnd w:id="31"/>
-    <w:bookmarkEnd w:id="32"/>
-    <w:bookmarkStart w:id="33" w:name="validação"/>
+    <w:bookmarkEnd w:id="34"/>
+    <w:bookmarkEnd w:id="35"/>
+    <w:bookmarkStart w:id="36" w:name="validação"/>
     <w:p>
       <w:pPr>
         <w:pStyle w:val="Heading2"/>
@@ -2795,8 +2862,8 @@
         <w:t xml:space="preserve">Relatório entregue em 08 de julho de 2026</w:t>
       </w:r>
     </w:p>
-    <w:bookmarkEnd w:id="33"/>
-    <w:bookmarkEnd w:id="34"/>
+    <w:bookmarkEnd w:id="36"/>
+    <w:bookmarkEnd w:id="37"/>
     <w:sectPr/>
   </w:body>
 </w:document>

</xml_diff>